<commit_message>
fix: print and docx
</commit_message>
<xml_diff>
--- a/FinalTesteAB.docx
+++ b/FinalTesteAB.docx
@@ -1398,15 +1398,12 @@
     </w:p>
     <w:p>
       <w:r>
-        <w:rPr>
-          <w:noProof/>
-        </w:rPr>
         <w:lastRenderedPageBreak/>
         <w:drawing>
-          <wp:inline distT="0" distB="0" distL="0" distR="0" wp14:anchorId="2DC1666A" wp14:editId="0397582D">
-            <wp:extent cx="4172532" cy="1762371"/>
-            <wp:effectExtent l="0" t="0" r="0" b="9525"/>
-            <wp:docPr id="228099012" name="Imagem 1" descr="Texto&#10;&#10;O conteúdo gerado por IA pode estar incorreto."/>
+          <wp:inline distT="0" distB="0" distL="0" distR="0" wp14:anchorId="33A7BFD6" wp14:editId="0D1FBB07">
+            <wp:extent cx="4182059" cy="1733792"/>
+            <wp:effectExtent l="0" t="0" r="9525" b="0"/>
+            <wp:docPr id="760110707" name="Imagem 1" descr="Texto&#10;&#10;O conteúdo gerado por IA pode estar incorreto."/>
             <wp:cNvGraphicFramePr>
               <a:graphicFrameLocks xmlns:a="http://schemas.openxmlformats.org/drawingml/2006/main" noChangeAspect="1"/>
             </wp:cNvGraphicFramePr>
@@ -1414,7 +1411,7 @@
               <a:graphicData uri="http://schemas.openxmlformats.org/drawingml/2006/picture">
                 <pic:pic xmlns:pic="http://schemas.openxmlformats.org/drawingml/2006/picture">
                   <pic:nvPicPr>
-                    <pic:cNvPr id="228099012" name="Imagem 1" descr="Texto&#10;&#10;O conteúdo gerado por IA pode estar incorreto."/>
+                    <pic:cNvPr id="760110707" name="Imagem 1" descr="Texto&#10;&#10;O conteúdo gerado por IA pode estar incorreto."/>
                     <pic:cNvPicPr/>
                   </pic:nvPicPr>
                   <pic:blipFill>
@@ -1426,7 +1423,7 @@
                   <pic:spPr>
                     <a:xfrm>
                       <a:off x="0" y="0"/>
-                      <a:ext cx="4172532" cy="1762371"/>
+                      <a:ext cx="4182059" cy="1733792"/>
                     </a:xfrm>
                     <a:prstGeom prst="rect">
                       <a:avLst/>

</xml_diff>